<commit_message>
report I. II. fin
</commit_message>
<xml_diff>
--- a/HW2/report/team6.docx
+++ b/HW2/report/team6.docx
@@ -156,14 +156,7 @@
           <w:rFonts w:ascii="Times New Roman" w:eastAsia="微軟正黑體" w:hAnsi="Times New Roman" w:cs="Times New Roman" w:hint="eastAsia"/>
           <w:u w:val="single"/>
         </w:rPr>
-        <w:t xml:space="preserve"> </w:t>
-      </w:r>
-      <w:r>
-        <w:rPr>
-          <w:rFonts w:ascii="Times New Roman" w:eastAsia="微軟正黑體" w:hAnsi="Times New Roman" w:cs="Times New Roman" w:hint="eastAsia"/>
-          <w:u w:val="single"/>
-        </w:rPr>
-        <w:t>Minimax</w:t>
+        <w:t xml:space="preserve"> Minimax</w:t>
       </w:r>
     </w:p>
     <w:p>
@@ -280,7 +273,7 @@
       <w:pPr>
         <w:spacing w:after="240" w:line="360" w:lineRule="exact"/>
         <w:rPr>
-          <w:rFonts w:ascii="Times New Roman" w:eastAsia="微軟正黑體" w:hAnsi="Times New Roman" w:cs="Times New Roman" w:hint="eastAsia"/>
+          <w:rFonts w:ascii="Times New Roman" w:eastAsia="微軟正黑體" w:hAnsi="Times New Roman" w:cs="Times New Roman"/>
         </w:rPr>
       </w:pPr>
       <w:r>
@@ -591,7 +584,7 @@
               <w:spacing w:line="360" w:lineRule="exact"/>
               <w:jc w:val="center"/>
               <w:rPr>
-                <w:rFonts w:ascii="Times New Roman" w:eastAsia="微軟正黑體" w:hAnsi="Times New Roman" w:cs="Times New Roman" w:hint="eastAsia"/>
+                <w:rFonts w:ascii="Times New Roman" w:eastAsia="微軟正黑體" w:hAnsi="Times New Roman" w:cs="Times New Roman"/>
               </w:rPr>
             </w:pPr>
             <w:r>
@@ -844,7 +837,7 @@
       <w:pPr>
         <w:widowControl/>
         <w:rPr>
-          <w:rFonts w:ascii="Times New Roman" w:eastAsia="微軟正黑體" w:hAnsi="Times New Roman" w:cs="Times New Roman" w:hint="eastAsia"/>
+          <w:rFonts w:ascii="Times New Roman" w:eastAsia="微軟正黑體" w:hAnsi="Times New Roman" w:cs="Times New Roman"/>
         </w:rPr>
       </w:pPr>
       <w:r>
@@ -906,7 +899,7 @@
       <w:pPr>
         <w:spacing w:after="240" w:line="360" w:lineRule="exact"/>
         <w:rPr>
-          <w:rFonts w:ascii="Times New Roman" w:eastAsia="微軟正黑體" w:hAnsi="Times New Roman" w:cs="Times New Roman" w:hint="eastAsia"/>
+          <w:rFonts w:ascii="Times New Roman" w:eastAsia="微軟正黑體" w:hAnsi="Times New Roman" w:cs="Times New Roman"/>
         </w:rPr>
       </w:pPr>
       <w:r>
@@ -932,7 +925,7 @@
       <w:pPr>
         <w:spacing w:line="360" w:lineRule="exact"/>
         <w:rPr>
-          <w:rFonts w:ascii="Times New Roman" w:eastAsia="微軟正黑體" w:hAnsi="Times New Roman" w:cs="Times New Roman" w:hint="eastAsia"/>
+          <w:rFonts w:ascii="Times New Roman" w:eastAsia="微軟正黑體" w:hAnsi="Times New Roman" w:cs="Times New Roman"/>
           <w:u w:val="single"/>
         </w:rPr>
       </w:pPr>
@@ -1082,7 +1075,7 @@
       <w:pPr>
         <w:spacing w:after="240" w:line="360" w:lineRule="exact"/>
         <w:rPr>
-          <w:rFonts w:ascii="Times New Roman" w:eastAsia="微軟正黑體" w:hAnsi="Times New Roman" w:cs="Times New Roman" w:hint="eastAsia"/>
+          <w:rFonts w:ascii="Times New Roman" w:eastAsia="微軟正黑體" w:hAnsi="Times New Roman" w:cs="Times New Roman"/>
         </w:rPr>
       </w:pPr>
       <w:r>
@@ -1160,7 +1153,7 @@
       <w:pPr>
         <w:spacing w:line="360" w:lineRule="exact"/>
         <w:rPr>
-          <w:rFonts w:ascii="Times New Roman" w:eastAsia="微軟正黑體" w:hAnsi="Times New Roman" w:cs="Times New Roman" w:hint="eastAsia"/>
+          <w:rFonts w:ascii="Times New Roman" w:eastAsia="微軟正黑體" w:hAnsi="Times New Roman" w:cs="Times New Roman"/>
           <w:u w:val="single"/>
         </w:rPr>
       </w:pPr>
@@ -1245,7 +1238,7 @@
       <w:pPr>
         <w:spacing w:after="240" w:line="360" w:lineRule="exact"/>
         <w:rPr>
-          <w:rFonts w:ascii="Times New Roman" w:eastAsia="微軟正黑體" w:hAnsi="Times New Roman" w:cs="Times New Roman" w:hint="eastAsia"/>
+          <w:rFonts w:ascii="Times New Roman" w:eastAsia="微軟正黑體" w:hAnsi="Times New Roman" w:cs="Times New Roman"/>
         </w:rPr>
       </w:pPr>
       <w:r>
@@ -1325,72 +1318,6 @@
           <w:rFonts w:ascii="Times New Roman" w:eastAsia="微軟正黑體" w:hAnsi="Times New Roman" w:cs="Times New Roman" w:hint="eastAsia"/>
         </w:rPr>
         <w:t xml:space="preserve"> </w:t>
-      </w:r>
-      <w:r>
-        <w:rPr>
-          <w:rFonts w:ascii="Times New Roman" w:eastAsia="微軟正黑體" w:hAnsi="Times New Roman" w:cs="Times New Roman" w:hint="eastAsia"/>
-        </w:rPr>
-        <w:t xml:space="preserve">It </w:t>
-      </w:r>
-      <w:r>
-        <w:rPr>
-          <w:rFonts w:ascii="Times New Roman" w:eastAsia="微軟正黑體" w:hAnsi="Times New Roman" w:cs="Times New Roman"/>
-        </w:rPr>
-        <w:t>build</w:t>
-      </w:r>
-      <w:r>
-        <w:rPr>
-          <w:rFonts w:ascii="Times New Roman" w:eastAsia="微軟正黑體" w:hAnsi="Times New Roman" w:cs="Times New Roman" w:hint="eastAsia"/>
-        </w:rPr>
-        <w:t>s</w:t>
-      </w:r>
-      <w:r>
-        <w:rPr>
-          <w:rFonts w:ascii="Times New Roman" w:eastAsia="微軟正黑體" w:hAnsi="Times New Roman" w:cs="Times New Roman"/>
-        </w:rPr>
-        <w:t xml:space="preserve"> multiple MCTS trees in parallel, with one thread per tree.</w:t>
-      </w:r>
-      <w:r>
-        <w:rPr>
-          <w:rFonts w:ascii="Times New Roman" w:eastAsia="微軟正黑體" w:hAnsi="Times New Roman" w:cs="Times New Roman" w:hint="eastAsia"/>
-        </w:rPr>
-        <w:t xml:space="preserve"> Since </w:t>
-      </w:r>
-      <w:r>
-        <w:rPr>
-          <w:rFonts w:ascii="Times New Roman" w:eastAsia="微軟正黑體" w:hAnsi="Times New Roman" w:cs="Times New Roman"/>
-        </w:rPr>
-        <w:t>the threads don</w:t>
-      </w:r>
-      <w:r>
-        <w:rPr>
-          <w:rFonts w:ascii="Times New Roman" w:eastAsia="微軟正黑體" w:hAnsi="Times New Roman" w:cs="Times New Roman"/>
-        </w:rPr>
-        <w:t>’</w:t>
-      </w:r>
-      <w:r>
-        <w:rPr>
-          <w:rFonts w:ascii="Times New Roman" w:eastAsia="微軟正黑體" w:hAnsi="Times New Roman" w:cs="Times New Roman"/>
-        </w:rPr>
-        <w:t>t share information with each other</w:t>
-      </w:r>
-      <w:r>
-        <w:rPr>
-          <w:rFonts w:ascii="Times New Roman" w:eastAsia="微軟正黑體" w:hAnsi="Times New Roman" w:cs="Times New Roman" w:hint="eastAsia"/>
-        </w:rPr>
-        <w:t>, this method doesn</w:t>
-      </w:r>
-      <w:r>
-        <w:rPr>
-          <w:rFonts w:ascii="Times New Roman" w:eastAsia="微軟正黑體" w:hAnsi="Times New Roman" w:cs="Times New Roman"/>
-        </w:rPr>
-        <w:t>’</w:t>
-      </w:r>
-      <w:r>
-        <w:rPr>
-          <w:rFonts w:ascii="Times New Roman" w:eastAsia="微軟正黑體" w:hAnsi="Times New Roman" w:cs="Times New Roman" w:hint="eastAsia"/>
-        </w:rPr>
-        <w:t xml:space="preserve">t require any mutex. </w:t>
       </w:r>
     </w:p>
     <w:tbl>
@@ -1398,6 +1325,14 @@
         <w:tblStyle w:val="a4"/>
         <w:tblW w:w="0" w:type="auto"/>
         <w:jc w:val="center"/>
+        <w:tblBorders>
+          <w:top w:val="none" w:sz="0" w:space="0" w:color="auto"/>
+          <w:left w:val="none" w:sz="0" w:space="0" w:color="auto"/>
+          <w:bottom w:val="none" w:sz="0" w:space="0" w:color="auto"/>
+          <w:right w:val="none" w:sz="0" w:space="0" w:color="auto"/>
+          <w:insideH w:val="none" w:sz="0" w:space="0" w:color="auto"/>
+          <w:insideV w:val="none" w:sz="0" w:space="0" w:color="auto"/>
+        </w:tblBorders>
         <w:tblLook w:val="04A0" w:firstRow="1" w:lastRow="0" w:firstColumn="1" w:lastColumn="0" w:noHBand="0" w:noVBand="1"/>
       </w:tblPr>
       <w:tblGrid>
@@ -1417,7 +1352,7 @@
               <w:spacing w:before="240" w:line="360" w:lineRule="exact"/>
               <w:jc w:val="center"/>
               <w:rPr>
-                <w:rFonts w:ascii="Times New Roman" w:eastAsia="微軟正黑體" w:hAnsi="Times New Roman" w:cs="Times New Roman" w:hint="eastAsia"/>
+                <w:rFonts w:ascii="Times New Roman" w:eastAsia="微軟正黑體" w:hAnsi="Times New Roman" w:cs="Times New Roman"/>
               </w:rPr>
             </w:pPr>
             <w:r>
@@ -1512,13 +1447,43 @@
         <w:rPr>
           <w:rFonts w:ascii="Times New Roman" w:eastAsia="微軟正黑體" w:hAnsi="Times New Roman" w:cs="Times New Roman" w:hint="eastAsia"/>
         </w:rPr>
-        <w:t xml:space="preserve">In the selection step of MCTS, </w:t>
-      </w:r>
-      <w:r>
-        <w:rPr>
-          <w:rFonts w:ascii="Times New Roman" w:eastAsia="微軟正黑體" w:hAnsi="Times New Roman" w:cs="Times New Roman" w:hint="eastAsia"/>
-        </w:rPr>
-        <w:t xml:space="preserve">we use </w:t>
+        <w:t>We</w:t>
+      </w:r>
+      <w:r>
+        <w:rPr>
+          <w:rFonts w:ascii="Times New Roman" w:eastAsia="微軟正黑體" w:hAnsi="Times New Roman" w:cs="Times New Roman"/>
+        </w:rPr>
+        <w:t xml:space="preserve"> build multiple MCTS trees in parallel, with one thread per tree. </w:t>
+      </w:r>
+      <w:r>
+        <w:rPr>
+          <w:rFonts w:ascii="Times New Roman" w:eastAsia="微軟正黑體" w:hAnsi="Times New Roman" w:cs="Times New Roman" w:hint="eastAsia"/>
+        </w:rPr>
+        <w:t>A</w:t>
+      </w:r>
+      <w:r>
+        <w:rPr>
+          <w:rFonts w:ascii="Times New Roman" w:eastAsia="微軟正黑體" w:hAnsi="Times New Roman" w:cs="Times New Roman" w:hint="eastAsia"/>
+        </w:rPr>
+        <w:t>lso</w:t>
+      </w:r>
+      <w:r>
+        <w:rPr>
+          <w:rFonts w:ascii="Times New Roman" w:eastAsia="微軟正黑體" w:hAnsi="Times New Roman" w:cs="Times New Roman" w:hint="eastAsia"/>
+        </w:rPr>
+        <w:t>, we</w:t>
+      </w:r>
+      <w:r>
+        <w:rPr>
+          <w:rFonts w:ascii="Times New Roman" w:eastAsia="微軟正黑體" w:hAnsi="Times New Roman" w:cs="Times New Roman" w:hint="eastAsia"/>
+        </w:rPr>
+        <w:t xml:space="preserve"> </w:t>
+      </w:r>
+      <w:r>
+        <w:rPr>
+          <w:rFonts w:ascii="Times New Roman" w:eastAsia="微軟正黑體" w:hAnsi="Times New Roman" w:cs="Times New Roman" w:hint="eastAsia"/>
+        </w:rPr>
+        <w:t xml:space="preserve">set the max simulation time to </w:t>
       </w:r>
       <w:r>
         <w:rPr>
@@ -1526,23 +1491,68 @@
           <w:b/>
           <w:bCs/>
         </w:rPr>
-        <w:t>UCT (</w:t>
-      </w:r>
-      <w:r>
-        <w:rPr>
-          <w:rFonts w:ascii="Times New Roman" w:eastAsia="微軟正黑體" w:hAnsi="Times New Roman" w:cs="Times New Roman"/>
+        <w:t>2500 milliseconds</w:t>
+      </w:r>
+      <w:r>
+        <w:rPr>
+          <w:rFonts w:ascii="Times New Roman" w:eastAsia="微軟正黑體" w:hAnsi="Times New Roman" w:cs="Times New Roman" w:hint="eastAsia"/>
+        </w:rPr>
+        <w:t xml:space="preserve">. </w:t>
+      </w:r>
+      <w:r>
+        <w:rPr>
+          <w:rFonts w:ascii="Times New Roman" w:eastAsia="微軟正黑體" w:hAnsi="Times New Roman" w:cs="Times New Roman"/>
+        </w:rPr>
+        <w:t xml:space="preserve">When all the simulations are done, the child nodes of root in separate trees will be merged by averaging their values, and the </w:t>
+      </w:r>
+      <w:r>
+        <w:rPr>
+          <w:rFonts w:ascii="Times New Roman" w:eastAsia="微軟正黑體" w:hAnsi="Times New Roman" w:cs="Times New Roman"/>
+        </w:rPr>
+        <w:lastRenderedPageBreak/>
+        <w:t>best move is selected based on the result. Since the threads don’t share information with each other, this method doesn’t require any mutex</w:t>
+      </w:r>
+      <w:r>
+        <w:rPr>
+          <w:rFonts w:ascii="Times New Roman" w:eastAsia="微軟正黑體" w:hAnsi="Times New Roman" w:cs="Times New Roman" w:hint="eastAsia"/>
+        </w:rPr>
+        <w:t>, making the parallelization more effective</w:t>
+      </w:r>
+      <w:r>
+        <w:rPr>
+          <w:rFonts w:ascii="Times New Roman" w:eastAsia="微軟正黑體" w:hAnsi="Times New Roman" w:cs="Times New Roman"/>
+        </w:rPr>
+        <w:t>.</w:t>
+      </w:r>
+    </w:p>
+    <w:p>
+      <w:pPr>
+        <w:spacing w:before="240" w:after="240" w:line="360" w:lineRule="exact"/>
+        <w:rPr>
+          <w:rFonts w:ascii="Times New Roman" w:eastAsia="微軟正黑體" w:hAnsi="Times New Roman" w:cs="Times New Roman"/>
+        </w:rPr>
+      </w:pPr>
+      <w:r>
+        <w:rPr>
+          <w:rFonts w:ascii="Times New Roman" w:eastAsia="微軟正黑體" w:hAnsi="Times New Roman" w:cs="Times New Roman" w:hint="eastAsia"/>
+        </w:rPr>
+        <w:t xml:space="preserve">In the selection step of MCTS, we use </w:t>
+      </w:r>
+      <w:r>
+        <w:rPr>
+          <w:rFonts w:ascii="Times New Roman" w:eastAsia="微軟正黑體" w:hAnsi="Times New Roman" w:cs="Times New Roman" w:hint="eastAsia"/>
           <w:b/>
           <w:bCs/>
         </w:rPr>
-        <w:t>Upper Confidence Bounds to Trees</w:t>
-      </w:r>
-      <w:r>
-        <w:rPr>
-          <w:rFonts w:ascii="Times New Roman" w:eastAsia="微軟正黑體" w:hAnsi="Times New Roman" w:cs="Times New Roman" w:hint="eastAsia"/>
+        <w:t>UCT (</w:t>
+      </w:r>
+      <w:r>
+        <w:rPr>
+          <w:rFonts w:ascii="Times New Roman" w:eastAsia="微軟正黑體" w:hAnsi="Times New Roman" w:cs="Times New Roman"/>
           <w:b/>
           <w:bCs/>
         </w:rPr>
-        <w:t xml:space="preserve">) </w:t>
+        <w:t>Upper Confidence Bounds to Trees</w:t>
       </w:r>
       <w:r>
         <w:rPr>
@@ -1550,26 +1560,13 @@
           <w:b/>
           <w:bCs/>
         </w:rPr>
-        <w:lastRenderedPageBreak/>
-        <w:t>formula</w:t>
-      </w:r>
-      <w:r>
-        <w:rPr>
-          <w:rFonts w:ascii="Times New Roman" w:eastAsia="微軟正黑體" w:hAnsi="Times New Roman" w:cs="Times New Roman" w:hint="eastAsia"/>
-        </w:rPr>
-        <w:t xml:space="preserve"> as the </w:t>
-      </w:r>
-      <w:r>
-        <w:rPr>
-          <w:rFonts w:ascii="Times New Roman" w:eastAsia="微軟正黑體" w:hAnsi="Times New Roman" w:cs="Times New Roman" w:hint="eastAsia"/>
-        </w:rPr>
-        <w:t xml:space="preserve">selection </w:t>
-      </w:r>
-      <w:r>
-        <w:rPr>
-          <w:rFonts w:ascii="Times New Roman" w:eastAsia="微軟正黑體" w:hAnsi="Times New Roman" w:cs="Times New Roman" w:hint="eastAsia"/>
-        </w:rPr>
-        <w:t xml:space="preserve">policy </w:t>
+        <w:t>) formula</w:t>
+      </w:r>
+      <w:r>
+        <w:rPr>
+          <w:rFonts w:ascii="Times New Roman" w:eastAsia="微軟正黑體" w:hAnsi="Times New Roman" w:cs="Times New Roman" w:hint="eastAsia"/>
+        </w:rPr>
+        <w:t xml:space="preserve"> as the selection policy </w:t>
       </w:r>
       <w:r>
         <w:rPr>
@@ -1671,7 +1668,7 @@
           <w:p>
             <w:pPr>
               <w:rPr>
-                <w:rFonts w:ascii="Times New Roman" w:eastAsia="新細明體" w:hAnsi="Times New Roman" w:cs="Times New Roman" w:hint="eastAsia"/>
+                <w:rFonts w:ascii="Times New Roman" w:eastAsia="新細明體" w:hAnsi="Times New Roman" w:cs="Times New Roman"/>
                 <w:sz w:val="22"/>
                 <w:szCs w:val="20"/>
               </w:rPr>
@@ -2339,7 +2336,7 @@
               <w:spacing w:before="240"/>
               <w:jc w:val="center"/>
               <w:rPr>
-                <w:rFonts w:ascii="Times New Roman" w:eastAsia="微軟正黑體" w:hAnsi="Times New Roman" w:cs="Times New Roman" w:hint="eastAsia"/>
+                <w:rFonts w:ascii="Times New Roman" w:eastAsia="微軟正黑體" w:hAnsi="Times New Roman" w:cs="Times New Roman"/>
                 <w:sz w:val="22"/>
                 <w:szCs w:val="20"/>
               </w:rPr>
@@ -2382,21 +2379,923 @@
     </w:tbl>
     <w:p>
       <w:pPr>
-        <w:spacing w:before="240" w:line="360" w:lineRule="exact"/>
-        <w:rPr>
-          <w:rFonts w:ascii="Times New Roman" w:eastAsia="微軟正黑體" w:hAnsi="Times New Roman" w:cs="Times New Roman" w:hint="eastAsia"/>
-        </w:rPr>
-      </w:pPr>
+        <w:spacing w:before="240" w:after="240" w:line="360" w:lineRule="exact"/>
+        <w:rPr>
+          <w:rFonts w:ascii="Times New Roman" w:eastAsia="微軟正黑體" w:hAnsi="Times New Roman" w:cs="Times New Roman"/>
+        </w:rPr>
+      </w:pPr>
+      <w:bookmarkStart w:id="0" w:name="_Hlk164207462"/>
+      <w:r>
+        <w:rPr>
+          <w:rFonts w:ascii="Times New Roman" w:eastAsia="微軟正黑體" w:hAnsi="Times New Roman" w:cs="Times New Roman" w:hint="eastAsia"/>
+        </w:rPr>
+        <w:t>In the backpropagation</w:t>
+      </w:r>
+      <w:r>
+        <w:rPr>
+          <w:rFonts w:ascii="Times New Roman" w:eastAsia="微軟正黑體" w:hAnsi="Times New Roman" w:cs="Times New Roman" w:hint="eastAsia"/>
+        </w:rPr>
+        <w:t xml:space="preserve"> step, we calculate</w:t>
+      </w:r>
+      <w:r>
+        <w:rPr>
+          <w:rFonts w:ascii="Times New Roman" w:eastAsia="微軟正黑體" w:hAnsi="Times New Roman" w:cs="Times New Roman" w:hint="eastAsia"/>
+        </w:rPr>
+        <w:t xml:space="preserve"> the score for each player at the terminal game state</w:t>
+      </w:r>
+      <w:r>
+        <w:rPr>
+          <w:rFonts w:ascii="Times New Roman" w:eastAsia="微軟正黑體" w:hAnsi="Times New Roman" w:cs="Times New Roman" w:hint="eastAsia"/>
+        </w:rPr>
+        <w:t xml:space="preserve"> </w:t>
+      </w:r>
+      <w:r>
+        <w:rPr>
+          <w:rFonts w:ascii="Times New Roman" w:eastAsia="微軟正黑體" w:hAnsi="Times New Roman" w:cs="Times New Roman" w:hint="eastAsia"/>
+        </w:rPr>
+        <w:t xml:space="preserve">and then compute the </w:t>
+      </w:r>
+      <w:r>
+        <w:rPr>
+          <w:rFonts w:ascii="Times New Roman" w:eastAsia="微軟正黑體" w:hAnsi="Times New Roman" w:cs="Times New Roman" w:hint="eastAsia"/>
+        </w:rPr>
+        <w:t>average</w:t>
+      </w:r>
+      <w:r>
+        <w:rPr>
+          <w:rFonts w:ascii="Times New Roman" w:eastAsia="微軟正黑體" w:hAnsi="Times New Roman" w:cs="Times New Roman" w:hint="eastAsia"/>
+        </w:rPr>
+        <w:t xml:space="preserve"> score </w:t>
+      </w:r>
+      <w:r>
+        <w:rPr>
+          <w:rFonts w:ascii="Times New Roman" w:eastAsia="微軟正黑體" w:hAnsi="Times New Roman" w:cs="Times New Roman" w:hint="eastAsia"/>
+        </w:rPr>
+        <w:t>for</w:t>
+      </w:r>
+      <w:r>
+        <w:rPr>
+          <w:rFonts w:ascii="Times New Roman" w:eastAsia="微軟正黑體" w:hAnsi="Times New Roman" w:cs="Times New Roman" w:hint="eastAsia"/>
+        </w:rPr>
+        <w:t xml:space="preserve"> each node as the value.</w:t>
+      </w:r>
+      <w:r>
+        <w:rPr>
+          <w:rFonts w:ascii="Times New Roman" w:eastAsia="微軟正黑體" w:hAnsi="Times New Roman" w:cs="Times New Roman" w:hint="eastAsia"/>
+        </w:rPr>
+        <w:t xml:space="preserve"> </w:t>
+      </w:r>
+    </w:p>
+    <w:tbl>
+      <w:tblPr>
+        <w:tblStyle w:val="a4"/>
+        <w:tblW w:w="0" w:type="auto"/>
+        <w:jc w:val="center"/>
+        <w:tblBorders>
+          <w:top w:val="none" w:sz="0" w:space="0" w:color="auto"/>
+          <w:left w:val="none" w:sz="0" w:space="0" w:color="auto"/>
+          <w:bottom w:val="none" w:sz="0" w:space="0" w:color="auto"/>
+          <w:right w:val="none" w:sz="0" w:space="0" w:color="auto"/>
+          <w:insideH w:val="none" w:sz="0" w:space="0" w:color="auto"/>
+          <w:insideV w:val="none" w:sz="0" w:space="0" w:color="auto"/>
+        </w:tblBorders>
+        <w:tblLook w:val="04A0" w:firstRow="1" w:lastRow="0" w:firstColumn="1" w:lastColumn="0" w:noHBand="0" w:noVBand="1"/>
+      </w:tblPr>
+      <w:tblGrid>
+        <w:gridCol w:w="8302"/>
+      </w:tblGrid>
+      <w:tr>
+        <w:trPr>
+          <w:jc w:val="center"/>
+        </w:trPr>
+        <w:tc>
+          <w:tcPr>
+            <w:tcW w:w="8302" w:type="dxa"/>
+            <w:vAlign w:val="center"/>
+          </w:tcPr>
+          <w:bookmarkEnd w:id="0"/>
+          <w:p>
+            <w:pPr>
+              <w:spacing w:line="360" w:lineRule="exact"/>
+              <w:jc w:val="center"/>
+              <w:rPr>
+                <w:rFonts w:ascii="Times New Roman" w:eastAsia="微軟正黑體" w:hAnsi="Times New Roman" w:cs="Times New Roman" w:hint="eastAsia"/>
+              </w:rPr>
+            </w:pPr>
+            <m:oMathPara>
+              <m:oMath>
+                <m:r>
+                  <w:rPr>
+                    <w:rFonts w:ascii="Cambria Math" w:eastAsia="微軟正黑體" w:hAnsi="Cambria Math" w:cs="Times New Roman"/>
+                    <w:sz w:val="18"/>
+                    <w:szCs w:val="16"/>
+                  </w:rPr>
+                  <m:t>The score of a player=round[ SUM(</m:t>
+                </m:r>
+                <m:sSup>
+                  <m:sSupPr>
+                    <m:ctrlPr>
+                      <w:rPr>
+                        <w:rFonts w:ascii="Cambria Math" w:eastAsia="微軟正黑體" w:hAnsi="Cambria Math" w:cs="Times New Roman"/>
+                        <w:i/>
+                        <w:sz w:val="18"/>
+                        <w:szCs w:val="16"/>
+                      </w:rPr>
+                    </m:ctrlPr>
+                  </m:sSupPr>
+                  <m:e>
+                    <m:r>
+                      <w:rPr>
+                        <w:rFonts w:ascii="Cambria Math" w:eastAsia="微軟正黑體" w:hAnsi="Cambria Math" w:cs="Times New Roman"/>
+                        <w:sz w:val="18"/>
+                        <w:szCs w:val="16"/>
+                      </w:rPr>
+                      <m:t xml:space="preserve"> (size of each connected region of a player's cells)</m:t>
+                    </m:r>
+                  </m:e>
+                  <m:sup>
+                    <m:r>
+                      <w:rPr>
+                        <w:rFonts w:ascii="Cambria Math" w:eastAsia="微軟正黑體" w:hAnsi="Cambria Math" w:cs="Times New Roman"/>
+                        <w:sz w:val="18"/>
+                        <w:szCs w:val="16"/>
+                      </w:rPr>
+                      <m:t>1.25</m:t>
+                    </m:r>
+                  </m:sup>
+                </m:sSup>
+                <m:r>
+                  <w:rPr>
+                    <w:rFonts w:ascii="Cambria Math" w:eastAsia="微軟正黑體" w:hAnsi="Cambria Math" w:cs="Times New Roman"/>
+                    <w:sz w:val="18"/>
+                    <w:szCs w:val="16"/>
+                  </w:rPr>
+                  <m:t xml:space="preserve"> ) ]</m:t>
+                </m:r>
+              </m:oMath>
+            </m:oMathPara>
+          </w:p>
+        </w:tc>
+      </w:tr>
+      <w:tr>
+        <w:trPr>
+          <w:jc w:val="center"/>
+        </w:trPr>
+        <w:tc>
+          <w:tcPr>
+            <w:tcW w:w="8302" w:type="dxa"/>
+            <w:vAlign w:val="center"/>
+          </w:tcPr>
+          <w:p>
+            <w:pPr>
+              <w:spacing w:before="240" w:line="360" w:lineRule="exact"/>
+              <w:jc w:val="center"/>
+              <w:rPr>
+                <w:rFonts w:ascii="Times New Roman" w:eastAsia="微軟正黑體" w:hAnsi="Times New Roman" w:cs="Times New Roman" w:hint="eastAsia"/>
+              </w:rPr>
+            </w:pPr>
+            <w:r>
+              <w:rPr>
+                <w:rFonts w:ascii="Times New Roman" w:eastAsia="微軟正黑體" w:hAnsi="Times New Roman" w:cs="Times New Roman" w:hint="eastAsia"/>
+                <w:sz w:val="22"/>
+                <w:szCs w:val="20"/>
+              </w:rPr>
+              <w:t>Equation</w:t>
+            </w:r>
+            <w:r>
+              <w:rPr>
+                <w:rFonts w:ascii="Times New Roman" w:eastAsia="微軟正黑體" w:hAnsi="Times New Roman" w:cs="Times New Roman"/>
+                <w:sz w:val="22"/>
+                <w:szCs w:val="20"/>
+              </w:rPr>
+              <w:t>.</w:t>
+            </w:r>
+            <w:r>
+              <w:rPr>
+                <w:rFonts w:ascii="Times New Roman" w:eastAsia="微軟正黑體" w:hAnsi="Times New Roman" w:cs="Times New Roman" w:hint="eastAsia"/>
+                <w:sz w:val="22"/>
+                <w:szCs w:val="20"/>
+              </w:rPr>
+              <w:t>2</w:t>
+            </w:r>
+            <w:r>
+              <w:rPr>
+                <w:rFonts w:ascii="Times New Roman" w:eastAsia="微軟正黑體" w:hAnsi="Times New Roman" w:cs="Times New Roman"/>
+                <w:sz w:val="22"/>
+                <w:szCs w:val="20"/>
+              </w:rPr>
+              <w:t xml:space="preserve">. </w:t>
+            </w:r>
+            <w:r>
+              <w:rPr>
+                <w:rFonts w:ascii="Times New Roman" w:eastAsia="微軟正黑體" w:hAnsi="Times New Roman" w:cs="Times New Roman" w:hint="eastAsia"/>
+                <w:sz w:val="22"/>
+                <w:szCs w:val="20"/>
+              </w:rPr>
+              <w:t xml:space="preserve">The </w:t>
+            </w:r>
+            <w:r>
+              <w:rPr>
+                <w:rFonts w:ascii="Times New Roman" w:eastAsia="微軟正黑體" w:hAnsi="Times New Roman" w:cs="Times New Roman" w:hint="eastAsia"/>
+                <w:sz w:val="22"/>
+                <w:szCs w:val="20"/>
+              </w:rPr>
+              <w:t>score</w:t>
+            </w:r>
+            <w:r>
+              <w:rPr>
+                <w:rFonts w:ascii="Times New Roman" w:eastAsia="微軟正黑體" w:hAnsi="Times New Roman" w:cs="Times New Roman" w:hint="eastAsia"/>
+                <w:sz w:val="22"/>
+                <w:szCs w:val="20"/>
+              </w:rPr>
+              <w:t xml:space="preserve"> </w:t>
+            </w:r>
+            <w:r>
+              <w:rPr>
+                <w:rFonts w:ascii="Times New Roman" w:eastAsia="微軟正黑體" w:hAnsi="Times New Roman" w:cs="Times New Roman"/>
+                <w:sz w:val="22"/>
+                <w:szCs w:val="20"/>
+              </w:rPr>
+              <w:t>calculation</w:t>
+            </w:r>
+            <w:r>
+              <w:rPr>
+                <w:rFonts w:ascii="Times New Roman" w:eastAsia="微軟正黑體" w:hAnsi="Times New Roman" w:cs="Times New Roman"/>
+                <w:sz w:val="22"/>
+                <w:szCs w:val="20"/>
+              </w:rPr>
+              <w:t>.</w:t>
+            </w:r>
+          </w:p>
+        </w:tc>
+      </w:tr>
+    </w:tbl>
+    <w:p>
+      <w:pPr>
+        <w:spacing w:line="360" w:lineRule="exact"/>
+        <w:rPr>
+          <w:rFonts w:ascii="Times New Roman" w:eastAsia="微軟正黑體" w:hAnsi="Times New Roman" w:cs="Times New Roman"/>
+          <w:u w:val="single"/>
+        </w:rPr>
+      </w:pPr>
+      <w:r>
+        <w:rPr>
+          <w:rFonts w:ascii="Times New Roman" w:eastAsia="微軟正黑體" w:hAnsi="Times New Roman" w:cs="Times New Roman" w:hint="eastAsia"/>
+          <w:u w:val="single"/>
+        </w:rPr>
+        <w:t xml:space="preserve">Agent </w:t>
+      </w:r>
+      <w:r>
+        <w:rPr>
+          <w:rFonts w:ascii="Times New Roman" w:eastAsia="微軟正黑體" w:hAnsi="Times New Roman" w:cs="Times New Roman" w:hint="eastAsia"/>
+          <w:u w:val="single"/>
+        </w:rPr>
+        <w:t>2</w:t>
+      </w:r>
+      <w:r>
+        <w:rPr>
+          <w:rFonts w:ascii="Times New Roman" w:eastAsia="微軟正黑體" w:hAnsi="Times New Roman" w:cs="Times New Roman" w:hint="eastAsia"/>
+          <w:u w:val="single"/>
+        </w:rPr>
+        <w:t>:</w:t>
+      </w:r>
     </w:p>
     <w:p>
       <w:pPr>
-        <w:widowControl/>
-        <w:rPr>
-          <w:rFonts w:ascii="Times New Roman" w:eastAsia="微軟正黑體" w:hAnsi="Times New Roman" w:cs="Times New Roman"/>
+        <w:spacing w:after="240" w:line="360" w:lineRule="exact"/>
+        <w:rPr>
+          <w:rFonts w:ascii="Times New Roman" w:eastAsia="微軟正黑體" w:hAnsi="Times New Roman" w:cs="Times New Roman"/>
+        </w:rPr>
+      </w:pPr>
+      <w:r>
+        <w:rPr>
+          <w:rFonts w:ascii="Times New Roman" w:eastAsia="微軟正黑體" w:hAnsi="Times New Roman" w:cs="Times New Roman" w:hint="eastAsia"/>
+        </w:rPr>
+        <w:t>This agent is</w:t>
+      </w:r>
+      <w:r>
+        <w:rPr>
+          <w:rFonts w:ascii="Times New Roman" w:eastAsia="微軟正黑體" w:hAnsi="Times New Roman" w:cs="Times New Roman" w:hint="eastAsia"/>
+        </w:rPr>
+        <w:t xml:space="preserve"> played on</w:t>
+      </w:r>
+      <w:r>
+        <w:rPr>
+          <w:rFonts w:ascii="Times New Roman" w:eastAsia="微軟正黑體" w:hAnsi="Times New Roman" w:cs="Times New Roman" w:hint="eastAsia"/>
+        </w:rPr>
+        <w:t xml:space="preserve"> t</w:t>
+      </w:r>
+      <w:r>
+        <w:rPr>
+          <w:rFonts w:ascii="Times New Roman" w:eastAsia="微軟正黑體" w:hAnsi="Times New Roman" w:cs="Times New Roman" w:hint="eastAsia"/>
+        </w:rPr>
+        <w:t xml:space="preserve">he </w:t>
+      </w:r>
+      <w:r>
+        <w:rPr>
+          <w:rFonts w:ascii="Times New Roman" w:eastAsia="微軟正黑體" w:hAnsi="Times New Roman" w:cs="Times New Roman" w:hint="eastAsia"/>
+        </w:rPr>
+        <w:t>o</w:t>
+      </w:r>
+      <w:r>
+        <w:rPr>
+          <w:rFonts w:ascii="Times New Roman" w:eastAsia="微軟正黑體" w:hAnsi="Times New Roman" w:cs="Times New Roman"/>
+        </w:rPr>
+        <w:t>vercrowded bigger board</w:t>
+      </w:r>
+      <w:r>
+        <w:rPr>
+          <w:rFonts w:ascii="Times New Roman" w:eastAsia="微軟正黑體" w:hAnsi="Times New Roman" w:cs="Times New Roman" w:hint="eastAsia"/>
+        </w:rPr>
+        <w:t xml:space="preserve"> </w:t>
+      </w:r>
+      <w:r>
+        <w:rPr>
+          <w:rFonts w:ascii="Times New Roman" w:eastAsia="微軟正黑體" w:hAnsi="Times New Roman" w:cs="Times New Roman" w:hint="eastAsia"/>
+        </w:rPr>
+        <w:t xml:space="preserve">which has </w:t>
+      </w:r>
+      <w:r>
+        <w:rPr>
+          <w:rFonts w:ascii="Times New Roman" w:eastAsia="微軟正黑體" w:hAnsi="Times New Roman" w:cs="Times New Roman"/>
+        </w:rPr>
+        <w:t xml:space="preserve">4 players, </w:t>
+      </w:r>
+      <w:r>
+        <w:rPr>
+          <w:rFonts w:ascii="Times New Roman" w:eastAsia="微軟正黑體" w:hAnsi="Times New Roman" w:cs="Times New Roman" w:hint="eastAsia"/>
+        </w:rPr>
+        <w:t>32</w:t>
+      </w:r>
+      <w:r>
+        <w:rPr>
+          <w:rFonts w:ascii="Times New Roman" w:eastAsia="微軟正黑體" w:hAnsi="Times New Roman" w:cs="Times New Roman"/>
+        </w:rPr>
+        <w:t xml:space="preserve"> sheep per player</w:t>
+      </w:r>
+      <w:r>
+        <w:rPr>
+          <w:rFonts w:ascii="Times New Roman" w:eastAsia="微軟正黑體" w:hAnsi="Times New Roman" w:cs="Times New Roman" w:hint="eastAsia"/>
+        </w:rPr>
+        <w:t xml:space="preserve"> and</w:t>
+      </w:r>
+      <w:r>
+        <w:rPr>
+          <w:rFonts w:ascii="Times New Roman" w:eastAsia="微軟正黑體" w:hAnsi="Times New Roman" w:cs="Times New Roman"/>
+        </w:rPr>
+        <w:t xml:space="preserve"> </w:t>
+      </w:r>
+      <w:r>
+        <w:rPr>
+          <w:rFonts w:ascii="Times New Roman" w:eastAsia="微軟正黑體" w:hAnsi="Times New Roman" w:cs="Times New Roman" w:hint="eastAsia"/>
+        </w:rPr>
+        <w:t>100</w:t>
+      </w:r>
+      <w:r>
+        <w:rPr>
+          <w:rFonts w:ascii="Times New Roman" w:eastAsia="微軟正黑體" w:hAnsi="Times New Roman" w:cs="Times New Roman"/>
+        </w:rPr>
+        <w:t>-cell playing field within a 1</w:t>
+      </w:r>
+      <w:r>
+        <w:rPr>
+          <w:rFonts w:ascii="Times New Roman" w:eastAsia="微軟正黑體" w:hAnsi="Times New Roman" w:cs="Times New Roman" w:hint="eastAsia"/>
+        </w:rPr>
+        <w:t>5</w:t>
+      </w:r>
+      <w:r>
+        <w:rPr>
+          <w:rFonts w:ascii="Times New Roman" w:eastAsia="微軟正黑體" w:hAnsi="Times New Roman" w:cs="Times New Roman" w:hint="eastAsia"/>
+        </w:rPr>
+        <w:t>x</w:t>
+      </w:r>
+      <w:r>
+        <w:rPr>
+          <w:rFonts w:ascii="Times New Roman" w:eastAsia="微軟正黑體" w:hAnsi="Times New Roman" w:cs="Times New Roman"/>
+        </w:rPr>
+        <w:t>1</w:t>
+      </w:r>
+      <w:r>
+        <w:rPr>
+          <w:rFonts w:ascii="Times New Roman" w:eastAsia="微軟正黑體" w:hAnsi="Times New Roman" w:cs="Times New Roman" w:hint="eastAsia"/>
+        </w:rPr>
+        <w:t>5</w:t>
+      </w:r>
+      <w:r>
+        <w:rPr>
+          <w:rFonts w:ascii="Times New Roman" w:eastAsia="微軟正黑體" w:hAnsi="Times New Roman" w:cs="Times New Roman"/>
+        </w:rPr>
+        <w:t xml:space="preserve"> square</w:t>
+      </w:r>
+      <w:r>
+        <w:rPr>
+          <w:rFonts w:ascii="Times New Roman" w:eastAsia="微軟正黑體" w:hAnsi="Times New Roman" w:cs="Times New Roman" w:hint="eastAsia"/>
+        </w:rPr>
+        <w:t xml:space="preserve">. </w:t>
+      </w:r>
+    </w:p>
+    <w:p>
+      <w:pPr>
+        <w:spacing w:after="240" w:line="360" w:lineRule="exact"/>
+        <w:rPr>
+          <w:rFonts w:ascii="Times New Roman" w:eastAsia="微軟正黑體" w:hAnsi="Times New Roman" w:cs="Times New Roman" w:hint="eastAsia"/>
+        </w:rPr>
+      </w:pPr>
+      <w:r>
+        <w:rPr>
+          <w:rFonts w:ascii="Times New Roman" w:eastAsia="微軟正黑體" w:hAnsi="Times New Roman" w:cs="Times New Roman" w:hint="eastAsia"/>
+        </w:rPr>
+        <w:t>We use the same architecture as Agent 1, only altering the</w:t>
+      </w:r>
+      <w:r>
+        <w:rPr>
+          <w:rFonts w:ascii="Times New Roman" w:eastAsia="微軟正黑體" w:hAnsi="Times New Roman" w:cs="Times New Roman" w:hint="eastAsia"/>
+        </w:rPr>
+        <w:t xml:space="preserve"> setting of</w:t>
+      </w:r>
+      <w:r>
+        <w:rPr>
+          <w:rFonts w:ascii="Times New Roman" w:eastAsia="微軟正黑體" w:hAnsi="Times New Roman" w:cs="Times New Roman" w:hint="eastAsia"/>
+        </w:rPr>
+        <w:t xml:space="preserve"> number of sheep and the size of board.</w:t>
+      </w:r>
+    </w:p>
+    <w:p>
+      <w:pPr>
+        <w:spacing w:line="360" w:lineRule="exact"/>
+        <w:rPr>
+          <w:rFonts w:ascii="Times New Roman" w:eastAsia="微軟正黑體" w:hAnsi="Times New Roman" w:cs="Times New Roman"/>
+          <w:u w:val="single"/>
+        </w:rPr>
+      </w:pPr>
+      <w:r>
+        <w:rPr>
+          <w:rFonts w:ascii="Times New Roman" w:eastAsia="微軟正黑體" w:hAnsi="Times New Roman" w:cs="Times New Roman" w:hint="eastAsia"/>
+          <w:u w:val="single"/>
+        </w:rPr>
+        <w:t xml:space="preserve">Agent </w:t>
+      </w:r>
+      <w:r>
+        <w:rPr>
+          <w:rFonts w:ascii="Times New Roman" w:eastAsia="微軟正黑體" w:hAnsi="Times New Roman" w:cs="Times New Roman" w:hint="eastAsia"/>
+          <w:u w:val="single"/>
+        </w:rPr>
+        <w:t>3</w:t>
+      </w:r>
+      <w:r>
+        <w:rPr>
+          <w:rFonts w:ascii="Times New Roman" w:eastAsia="微軟正黑體" w:hAnsi="Times New Roman" w:cs="Times New Roman" w:hint="eastAsia"/>
+          <w:u w:val="single"/>
+        </w:rPr>
+        <w:t>:</w:t>
+      </w:r>
+    </w:p>
+    <w:p>
+      <w:pPr>
+        <w:spacing w:after="240" w:line="360" w:lineRule="exact"/>
+        <w:rPr>
+          <w:rFonts w:ascii="Times New Roman" w:eastAsia="微軟正黑體" w:hAnsi="Times New Roman" w:cs="Times New Roman" w:hint="eastAsia"/>
+        </w:rPr>
+      </w:pPr>
+      <w:r>
+        <w:rPr>
+          <w:rFonts w:ascii="Times New Roman" w:eastAsia="微軟正黑體" w:hAnsi="Times New Roman" w:cs="Times New Roman" w:hint="eastAsia"/>
+        </w:rPr>
+        <w:t xml:space="preserve">This agent </w:t>
+      </w:r>
+      <w:r>
+        <w:rPr>
+          <w:rFonts w:ascii="Times New Roman" w:eastAsia="微軟正黑體" w:hAnsi="Times New Roman" w:cs="Times New Roman" w:hint="eastAsia"/>
+        </w:rPr>
+        <w:t>has</w:t>
+      </w:r>
+      <w:r>
+        <w:rPr>
+          <w:rFonts w:ascii="Times New Roman" w:eastAsia="微軟正黑體" w:hAnsi="Times New Roman" w:cs="Times New Roman" w:hint="eastAsia"/>
+        </w:rPr>
+        <w:t xml:space="preserve"> </w:t>
+      </w:r>
+      <w:r>
+        <w:rPr>
+          <w:rFonts w:ascii="Times New Roman" w:eastAsia="微軟正黑體" w:hAnsi="Times New Roman" w:cs="Times New Roman" w:hint="eastAsia"/>
+        </w:rPr>
+        <w:t>the same form as Agent 1 with imperfect information</w:t>
+      </w:r>
+      <w:r>
+        <w:rPr>
+          <w:rFonts w:ascii="Times New Roman" w:eastAsia="微軟正黑體" w:hAnsi="Times New Roman" w:cs="Times New Roman" w:hint="eastAsia"/>
+        </w:rPr>
+        <w:t xml:space="preserve">: </w:t>
+      </w:r>
+      <w:r>
+        <w:rPr>
+          <w:rFonts w:ascii="Times New Roman" w:eastAsia="微軟正黑體" w:hAnsi="Times New Roman" w:cs="Times New Roman"/>
+        </w:rPr>
+        <w:t>A player does not know the numbers of sheep in the cells occupied by the other players.</w:t>
+      </w:r>
+    </w:p>
+    <w:p>
+      <w:pPr>
+        <w:spacing w:after="240" w:line="360" w:lineRule="exact"/>
+        <w:rPr>
+          <w:rFonts w:ascii="Times New Roman" w:eastAsia="微軟正黑體" w:hAnsi="Times New Roman" w:cs="Times New Roman"/>
+        </w:rPr>
+      </w:pPr>
+      <w:r>
+        <w:rPr>
+          <w:rFonts w:ascii="Times New Roman" w:eastAsia="微軟正黑體" w:hAnsi="Times New Roman" w:cs="Times New Roman" w:hint="eastAsia"/>
+        </w:rPr>
+        <w:t xml:space="preserve">We use the </w:t>
+      </w:r>
+      <w:r>
+        <w:rPr>
+          <w:rFonts w:ascii="Times New Roman" w:eastAsia="微軟正黑體" w:hAnsi="Times New Roman" w:cs="Times New Roman" w:hint="eastAsia"/>
+        </w:rPr>
+        <w:t>similar</w:t>
+      </w:r>
+      <w:r>
+        <w:rPr>
+          <w:rFonts w:ascii="Times New Roman" w:eastAsia="微軟正黑體" w:hAnsi="Times New Roman" w:cs="Times New Roman" w:hint="eastAsia"/>
+        </w:rPr>
+        <w:t xml:space="preserve"> architecture </w:t>
+      </w:r>
+      <w:r>
+        <w:rPr>
+          <w:rFonts w:ascii="Times New Roman" w:eastAsia="微軟正黑體" w:hAnsi="Times New Roman" w:cs="Times New Roman" w:hint="eastAsia"/>
+        </w:rPr>
+        <w:t xml:space="preserve">to </w:t>
+      </w:r>
+      <w:r>
+        <w:rPr>
+          <w:rFonts w:ascii="Times New Roman" w:eastAsia="微軟正黑體" w:hAnsi="Times New Roman" w:cs="Times New Roman" w:hint="eastAsia"/>
+        </w:rPr>
+        <w:t>A</w:t>
+      </w:r>
+      <w:r>
+        <w:rPr>
+          <w:rFonts w:ascii="Times New Roman" w:eastAsia="微軟正黑體" w:hAnsi="Times New Roman" w:cs="Times New Roman" w:hint="eastAsia"/>
+        </w:rPr>
+        <w:t xml:space="preserve">gent </w:t>
+      </w:r>
+      <w:r>
+        <w:rPr>
+          <w:rFonts w:ascii="Times New Roman" w:eastAsia="微軟正黑體" w:hAnsi="Times New Roman" w:cs="Times New Roman" w:hint="eastAsia"/>
+        </w:rPr>
+        <w:t>1</w:t>
+      </w:r>
+      <w:r>
+        <w:rPr>
+          <w:rFonts w:ascii="Times New Roman" w:eastAsia="微軟正黑體" w:hAnsi="Times New Roman" w:cs="Times New Roman" w:hint="eastAsia"/>
+        </w:rPr>
+        <w:t>.</w:t>
+      </w:r>
+      <w:r>
+        <w:rPr>
+          <w:rFonts w:ascii="Times New Roman" w:eastAsia="微軟正黑體" w:hAnsi="Times New Roman" w:cs="Times New Roman" w:hint="eastAsia"/>
+        </w:rPr>
+        <w:t xml:space="preserve"> </w:t>
+      </w:r>
+      <w:r>
+        <w:rPr>
+          <w:rFonts w:ascii="Times New Roman" w:eastAsia="微軟正黑體" w:hAnsi="Times New Roman" w:cs="Times New Roman" w:hint="eastAsia"/>
+        </w:rPr>
+        <w:t>However,</w:t>
+      </w:r>
+      <w:r>
+        <w:rPr>
+          <w:rFonts w:ascii="Times New Roman" w:eastAsia="微軟正黑體" w:hAnsi="Times New Roman" w:cs="Times New Roman" w:hint="eastAsia"/>
+        </w:rPr>
+        <w:t xml:space="preserve"> </w:t>
+      </w:r>
+      <w:r>
+        <w:rPr>
+          <w:rFonts w:ascii="Times New Roman" w:eastAsia="微軟正黑體" w:hAnsi="Times New Roman" w:cs="Times New Roman" w:hint="eastAsia"/>
+        </w:rPr>
+        <w:t xml:space="preserve">due to the imperfect information, we consider </w:t>
+      </w:r>
+      <w:r>
+        <w:rPr>
+          <w:rFonts w:ascii="Times New Roman" w:eastAsia="微軟正黑體" w:hAnsi="Times New Roman" w:cs="Times New Roman"/>
+        </w:rPr>
+        <w:t>the number of sheep in the cells</w:t>
+      </w:r>
+      <w:r>
+        <w:rPr>
+          <w:rFonts w:ascii="Times New Roman" w:eastAsia="微軟正黑體" w:hAnsi="Times New Roman" w:cs="Times New Roman" w:hint="eastAsia"/>
+        </w:rPr>
+        <w:t xml:space="preserve"> </w:t>
+      </w:r>
+      <w:r>
+        <w:rPr>
+          <w:rFonts w:ascii="Times New Roman" w:eastAsia="微軟正黑體" w:hAnsi="Times New Roman" w:cs="Times New Roman"/>
+        </w:rPr>
+        <w:t>occupied by the other players</w:t>
+      </w:r>
+      <w:r>
+        <w:rPr>
+          <w:rFonts w:ascii="Times New Roman" w:eastAsia="微軟正黑體" w:hAnsi="Times New Roman" w:cs="Times New Roman" w:hint="eastAsia"/>
+        </w:rPr>
+        <w:t xml:space="preserve"> </w:t>
+      </w:r>
+      <w:r>
+        <w:rPr>
+          <w:rFonts w:ascii="Times New Roman" w:eastAsia="微軟正黑體" w:hAnsi="Times New Roman" w:cs="Times New Roman" w:hint="eastAsia"/>
+        </w:rPr>
+        <w:t xml:space="preserve">as the </w:t>
+      </w:r>
+      <w:r>
+        <w:rPr>
+          <w:rFonts w:ascii="Times New Roman" w:eastAsia="微軟正黑體" w:hAnsi="Times New Roman" w:cs="Times New Roman" w:hint="eastAsia"/>
           <w:b/>
           <w:bCs/>
         </w:rPr>
-      </w:pPr>
+        <w:t>maximum possible number</w:t>
+      </w:r>
+      <w:r>
+        <w:rPr>
+          <w:rFonts w:ascii="Times New Roman" w:eastAsia="微軟正黑體" w:hAnsi="Times New Roman" w:cs="Times New Roman" w:hint="eastAsia"/>
+        </w:rPr>
+        <w:t>.</w:t>
+      </w:r>
+      <w:r>
+        <w:rPr>
+          <w:rFonts w:ascii="Times New Roman" w:eastAsia="微軟正黑體" w:hAnsi="Times New Roman" w:cs="Times New Roman" w:hint="eastAsia"/>
+        </w:rPr>
+        <w:t xml:space="preserve"> For example, if Player 2 has occupied </w:t>
+      </w:r>
+      <w:r>
+        <w:rPr>
+          <w:rFonts w:ascii="Times New Roman" w:eastAsia="微軟正黑體" w:hAnsi="Times New Roman" w:cs="Times New Roman" w:hint="eastAsia"/>
+        </w:rPr>
+        <w:t>two</w:t>
+      </w:r>
+      <w:r>
+        <w:rPr>
+          <w:rFonts w:ascii="Times New Roman" w:eastAsia="微軟正黑體" w:hAnsi="Times New Roman" w:cs="Times New Roman" w:hint="eastAsia"/>
+        </w:rPr>
+        <w:t xml:space="preserve"> cells, then the number of sheep in each cell will be assumed as </w:t>
+      </w:r>
+      <w:r>
+        <w:rPr>
+          <w:rFonts w:ascii="Times New Roman" w:eastAsia="微軟正黑體" w:hAnsi="Times New Roman" w:cs="Times New Roman" w:hint="eastAsia"/>
+        </w:rPr>
+        <w:t>(</w:t>
+      </w:r>
+      <w:r>
+        <w:rPr>
+          <w:rFonts w:ascii="Times New Roman" w:eastAsia="微軟正黑體" w:hAnsi="Times New Roman" w:cs="Times New Roman" w:hint="eastAsia"/>
+          <w:b/>
+          <w:bCs/>
+        </w:rPr>
+        <w:t xml:space="preserve">the total number of sheep </w:t>
+      </w:r>
+      <w:r>
+        <w:rPr>
+          <w:rFonts w:ascii="Times New Roman" w:eastAsia="微軟正黑體" w:hAnsi="Times New Roman" w:cs="Times New Roman"/>
+          <w:b/>
+          <w:bCs/>
+        </w:rPr>
+        <w:t>–</w:t>
+      </w:r>
+      <w:r>
+        <w:rPr>
+          <w:rFonts w:ascii="Times New Roman" w:eastAsia="微軟正黑體" w:hAnsi="Times New Roman" w:cs="Times New Roman" w:hint="eastAsia"/>
+          <w:b/>
+          <w:bCs/>
+        </w:rPr>
+        <w:t xml:space="preserve"> the number of occupied cells + 1</w:t>
+      </w:r>
+      <w:r>
+        <w:rPr>
+          <w:rFonts w:ascii="Times New Roman" w:eastAsia="微軟正黑體" w:hAnsi="Times New Roman" w:cs="Times New Roman" w:hint="eastAsia"/>
+          <w:b/>
+          <w:bCs/>
+        </w:rPr>
+        <w:t>)</w:t>
+      </w:r>
+      <w:r>
+        <w:rPr>
+          <w:rFonts w:ascii="Times New Roman" w:eastAsia="微軟正黑體" w:hAnsi="Times New Roman" w:cs="Times New Roman" w:hint="eastAsia"/>
+        </w:rPr>
+        <w:t xml:space="preserve"> = 16 </w:t>
+      </w:r>
+      <w:r>
+        <w:rPr>
+          <w:rFonts w:ascii="Times New Roman" w:eastAsia="微軟正黑體" w:hAnsi="Times New Roman" w:cs="Times New Roman"/>
+        </w:rPr>
+        <w:t>–</w:t>
+      </w:r>
+      <w:r>
+        <w:rPr>
+          <w:rFonts w:ascii="Times New Roman" w:eastAsia="微軟正黑體" w:hAnsi="Times New Roman" w:cs="Times New Roman" w:hint="eastAsia"/>
+        </w:rPr>
+        <w:t xml:space="preserve"> 2 + 1 = 15.</w:t>
+      </w:r>
+      <w:r>
+        <w:rPr>
+          <w:rFonts w:ascii="Times New Roman" w:eastAsia="微軟正黑體" w:hAnsi="Times New Roman" w:cs="Times New Roman" w:hint="eastAsia"/>
+        </w:rPr>
+        <w:t xml:space="preserve"> Therefore, the number of legal moves</w:t>
+      </w:r>
+      <w:r>
+        <w:rPr>
+          <w:rFonts w:ascii="Times New Roman" w:eastAsia="微軟正黑體" w:hAnsi="Times New Roman" w:cs="Times New Roman" w:hint="eastAsia"/>
+        </w:rPr>
+        <w:t xml:space="preserve"> for the other players</w:t>
+      </w:r>
+      <w:r>
+        <w:rPr>
+          <w:rFonts w:ascii="Times New Roman" w:eastAsia="微軟正黑體" w:hAnsi="Times New Roman" w:cs="Times New Roman" w:hint="eastAsia"/>
+        </w:rPr>
+        <w:t xml:space="preserve"> will increase.</w:t>
+      </w:r>
+    </w:p>
+    <w:p>
+      <w:pPr>
+        <w:spacing w:line="360" w:lineRule="exact"/>
+        <w:rPr>
+          <w:rFonts w:ascii="Times New Roman" w:eastAsia="微軟正黑體" w:hAnsi="Times New Roman" w:cs="Times New Roman"/>
+          <w:u w:val="single"/>
+        </w:rPr>
+      </w:pPr>
+      <w:r>
+        <w:rPr>
+          <w:rFonts w:ascii="Times New Roman" w:eastAsia="微軟正黑體" w:hAnsi="Times New Roman" w:cs="Times New Roman" w:hint="eastAsia"/>
+          <w:u w:val="single"/>
+        </w:rPr>
+        <w:t xml:space="preserve">Agent </w:t>
+      </w:r>
+      <w:r>
+        <w:rPr>
+          <w:rFonts w:ascii="Times New Roman" w:eastAsia="微軟正黑體" w:hAnsi="Times New Roman" w:cs="Times New Roman" w:hint="eastAsia"/>
+          <w:u w:val="single"/>
+        </w:rPr>
+        <w:t>4</w:t>
+      </w:r>
+      <w:r>
+        <w:rPr>
+          <w:rFonts w:ascii="Times New Roman" w:eastAsia="微軟正黑體" w:hAnsi="Times New Roman" w:cs="Times New Roman" w:hint="eastAsia"/>
+          <w:u w:val="single"/>
+        </w:rPr>
+        <w:t>:</w:t>
+      </w:r>
+    </w:p>
+    <w:p>
+      <w:pPr>
+        <w:spacing w:after="240" w:line="360" w:lineRule="exact"/>
+        <w:rPr>
+          <w:rFonts w:ascii="Times New Roman" w:eastAsia="微軟正黑體" w:hAnsi="Times New Roman" w:cs="Times New Roman"/>
+        </w:rPr>
+      </w:pPr>
+      <w:r>
+        <w:rPr>
+          <w:rFonts w:ascii="Times New Roman" w:eastAsia="微軟正黑體" w:hAnsi="Times New Roman" w:cs="Times New Roman" w:hint="eastAsia"/>
+        </w:rPr>
+        <w:t xml:space="preserve">This agent has the same form as Agent 1 with </w:t>
+      </w:r>
+      <w:r>
+        <w:rPr>
+          <w:rFonts w:ascii="Times New Roman" w:eastAsia="微軟正黑體" w:hAnsi="Times New Roman" w:cs="Times New Roman" w:hint="eastAsia"/>
+        </w:rPr>
+        <w:t>c</w:t>
+      </w:r>
+      <w:r>
+        <w:rPr>
+          <w:rFonts w:ascii="Times New Roman" w:eastAsia="微軟正黑體" w:hAnsi="Times New Roman" w:cs="Times New Roman"/>
+        </w:rPr>
+        <w:t>ooperati</w:t>
+      </w:r>
+      <w:r>
+        <w:rPr>
+          <w:rFonts w:ascii="Times New Roman" w:eastAsia="微軟正黑體" w:hAnsi="Times New Roman" w:cs="Times New Roman" w:hint="eastAsia"/>
+        </w:rPr>
+        <w:t>on. T</w:t>
+      </w:r>
+      <w:r>
+        <w:rPr>
+          <w:rFonts w:ascii="Times New Roman" w:eastAsia="微軟正黑體" w:hAnsi="Times New Roman" w:cs="Times New Roman"/>
+        </w:rPr>
+        <w:t xml:space="preserve">he four players form two pairs: Players 1 &amp; 3, and Players 2 &amp; 4. </w:t>
+      </w:r>
+    </w:p>
+    <w:p>
+      <w:pPr>
+        <w:spacing w:before="240" w:after="240" w:line="360" w:lineRule="exact"/>
+        <w:rPr>
+          <w:rFonts w:ascii="Times New Roman" w:eastAsia="微軟正黑體" w:hAnsi="Times New Roman" w:cs="Times New Roman"/>
+          <w:b/>
+          <w:bCs/>
+        </w:rPr>
+      </w:pPr>
+      <w:r>
+        <w:rPr>
+          <w:rFonts w:ascii="Times New Roman" w:eastAsia="微軟正黑體" w:hAnsi="Times New Roman" w:cs="Times New Roman" w:hint="eastAsia"/>
+        </w:rPr>
+        <w:t xml:space="preserve">We use the </w:t>
+      </w:r>
+      <w:r>
+        <w:rPr>
+          <w:rFonts w:ascii="Times New Roman" w:eastAsia="微軟正黑體" w:hAnsi="Times New Roman" w:cs="Times New Roman" w:hint="eastAsia"/>
+        </w:rPr>
+        <w:t>similar</w:t>
+      </w:r>
+      <w:r>
+        <w:rPr>
+          <w:rFonts w:ascii="Times New Roman" w:eastAsia="微軟正黑體" w:hAnsi="Times New Roman" w:cs="Times New Roman" w:hint="eastAsia"/>
+        </w:rPr>
+        <w:t xml:space="preserve"> architecture </w:t>
+      </w:r>
+      <w:r>
+        <w:rPr>
+          <w:rFonts w:ascii="Times New Roman" w:eastAsia="微軟正黑體" w:hAnsi="Times New Roman" w:cs="Times New Roman" w:hint="eastAsia"/>
+        </w:rPr>
+        <w:t>to</w:t>
+      </w:r>
+      <w:r>
+        <w:rPr>
+          <w:rFonts w:ascii="Times New Roman" w:eastAsia="微軟正黑體" w:hAnsi="Times New Roman" w:cs="Times New Roman" w:hint="eastAsia"/>
+        </w:rPr>
+        <w:t xml:space="preserve"> Agent 1</w:t>
+      </w:r>
+      <w:r>
+        <w:rPr>
+          <w:rFonts w:ascii="Times New Roman" w:eastAsia="微軟正黑體" w:hAnsi="Times New Roman" w:cs="Times New Roman" w:hint="eastAsia"/>
+        </w:rPr>
+        <w:t>, but i</w:t>
+      </w:r>
+      <w:r>
+        <w:rPr>
+          <w:rFonts w:ascii="Times New Roman" w:eastAsia="微軟正黑體" w:hAnsi="Times New Roman" w:cs="Times New Roman" w:hint="eastAsia"/>
+        </w:rPr>
+        <w:t xml:space="preserve">n the backpropagation step, we </w:t>
+      </w:r>
+      <w:r>
+        <w:rPr>
+          <w:rFonts w:ascii="Times New Roman" w:eastAsia="微軟正黑體" w:hAnsi="Times New Roman" w:cs="Times New Roman" w:hint="eastAsia"/>
+        </w:rPr>
+        <w:lastRenderedPageBreak/>
+        <w:t xml:space="preserve">calculate the </w:t>
+      </w:r>
+      <w:r>
+        <w:rPr>
+          <w:rFonts w:ascii="Times New Roman" w:eastAsia="微軟正黑體" w:hAnsi="Times New Roman" w:cs="Times New Roman" w:hint="eastAsia"/>
+        </w:rPr>
+        <w:t xml:space="preserve">sum of </w:t>
+      </w:r>
+      <w:r>
+        <w:rPr>
+          <w:rFonts w:ascii="Times New Roman" w:eastAsia="微軟正黑體" w:hAnsi="Times New Roman" w:cs="Times New Roman" w:hint="eastAsia"/>
+        </w:rPr>
+        <w:t>score for player</w:t>
+      </w:r>
+      <w:r>
+        <w:rPr>
+          <w:rFonts w:ascii="Times New Roman" w:eastAsia="微軟正黑體" w:hAnsi="Times New Roman" w:cs="Times New Roman" w:hint="eastAsia"/>
+        </w:rPr>
+        <w:t>s in the same pair instead</w:t>
+      </w:r>
+      <w:r>
+        <w:rPr>
+          <w:rFonts w:ascii="Times New Roman" w:eastAsia="微軟正黑體" w:hAnsi="Times New Roman" w:cs="Times New Roman" w:hint="eastAsia"/>
+        </w:rPr>
+        <w:t>.</w:t>
+      </w:r>
+      <w:r>
+        <w:rPr>
+          <w:rFonts w:ascii="Times New Roman" w:eastAsia="微軟正黑體" w:hAnsi="Times New Roman" w:cs="Times New Roman" w:hint="eastAsia"/>
+        </w:rPr>
+        <w:t xml:space="preserve"> By doing so, the player will choose the best move that </w:t>
+      </w:r>
+      <w:r>
+        <w:rPr>
+          <w:rFonts w:ascii="Times New Roman" w:eastAsia="微軟正黑體" w:hAnsi="Times New Roman" w:cs="Times New Roman" w:hint="eastAsia"/>
+        </w:rPr>
+        <w:t>can increase</w:t>
+      </w:r>
+      <w:r>
+        <w:rPr>
+          <w:rFonts w:ascii="Times New Roman" w:eastAsia="微軟正黑體" w:hAnsi="Times New Roman" w:cs="Times New Roman" w:hint="eastAsia"/>
+        </w:rPr>
+        <w:t xml:space="preserve"> not only his own score but also his partner</w:t>
+      </w:r>
+      <w:r>
+        <w:rPr>
+          <w:rFonts w:ascii="Times New Roman" w:eastAsia="微軟正黑體" w:hAnsi="Times New Roman" w:cs="Times New Roman"/>
+        </w:rPr>
+        <w:t>’</w:t>
+      </w:r>
+      <w:r>
+        <w:rPr>
+          <w:rFonts w:ascii="Times New Roman" w:eastAsia="微軟正黑體" w:hAnsi="Times New Roman" w:cs="Times New Roman" w:hint="eastAsia"/>
+        </w:rPr>
+        <w:t>s.</w:t>
+      </w:r>
+      <w:r>
+        <w:rPr>
+          <w:rFonts w:ascii="Times New Roman" w:eastAsia="微軟正黑體" w:hAnsi="Times New Roman" w:cs="Times New Roman" w:hint="eastAsia"/>
+        </w:rPr>
+        <w:t xml:space="preserve"> </w:t>
+      </w:r>
     </w:p>
     <w:p>
       <w:pPr>
@@ -2561,11 +3460,11 @@
       <w:pPr>
         <w:spacing w:line="360" w:lineRule="exact"/>
         <w:rPr>
-          <w:rFonts w:ascii="Times New Roman" w:eastAsia="微軟正黑體" w:hAnsi="Times New Roman" w:cs="Times New Roman" w:hint="eastAsia"/>
+          <w:rFonts w:ascii="Times New Roman" w:eastAsia="微軟正黑體" w:hAnsi="Times New Roman" w:cs="Times New Roman"/>
           <w:u w:val="single"/>
         </w:rPr>
       </w:pPr>
-      <w:bookmarkStart w:id="0" w:name="_Hlk164170842"/>
+      <w:bookmarkStart w:id="1" w:name="_Hlk164170842"/>
       <w:r>
         <w:rPr>
           <w:rFonts w:ascii="Times New Roman" w:eastAsia="微軟正黑體" w:hAnsi="Times New Roman" w:cs="Times New Roman" w:hint="eastAsia"/>
@@ -2588,7 +3487,7 @@
         <w:t>Game1</w:t>
       </w:r>
     </w:p>
-    <w:bookmarkEnd w:id="0"/>
+    <w:bookmarkEnd w:id="1"/>
     <w:p>
       <w:pPr>
         <w:pStyle w:val="a3"/>
@@ -2617,7 +3516,7 @@
           <w:rFonts w:ascii="Times New Roman" w:eastAsia="微軟正黑體" w:hAnsi="Times New Roman" w:cs="Times New Roman"/>
         </w:rPr>
       </w:pPr>
-      <w:bookmarkStart w:id="1" w:name="_Hlk161619948"/>
+      <w:bookmarkStart w:id="2" w:name="_Hlk161619948"/>
       <w:r>
         <w:rPr>
           <w:rFonts w:ascii="Times New Roman" w:eastAsia="微軟正黑體" w:hAnsi="Times New Roman" w:cs="Times New Roman" w:hint="eastAsia"/>
@@ -2674,7 +3573,6 @@
         </w:rPr>
         <w:t xml:space="preserve">the </w:t>
       </w:r>
-      <w:proofErr w:type="spellStart"/>
       <w:r>
         <w:rPr>
           <w:rFonts w:ascii="Times New Roman" w:eastAsia="微軟正黑體" w:hAnsi="Times New Roman" w:cs="Times New Roman"/>
@@ -2683,7 +3581,6 @@
         </w:rPr>
         <w:t>Farneback</w:t>
       </w:r>
-      <w:proofErr w:type="spellEnd"/>
       <w:r>
         <w:rPr>
           <w:rFonts w:ascii="Times New Roman" w:eastAsia="微軟正黑體" w:hAnsi="Times New Roman" w:cs="Times New Roman"/>
@@ -2711,7 +3608,7 @@
         <w:t>.</w:t>
       </w:r>
     </w:p>
-    <w:bookmarkEnd w:id="1"/>
+    <w:bookmarkEnd w:id="2"/>
     <w:p>
       <w:pPr>
         <w:pStyle w:val="a3"/>
@@ -3018,16 +3915,16 @@
         <w:spacing w:line="360" w:lineRule="exact"/>
         <w:rPr>
           <w:rFonts w:ascii="Times New Roman" w:eastAsia="微軟正黑體" w:hAnsi="Times New Roman" w:cs="Times New Roman"/>
-        </w:rPr>
-      </w:pPr>
-      <w:proofErr w:type="spellStart"/>
+          <w:sz w:val="22"/>
+          <w:szCs w:val="20"/>
+        </w:rPr>
+      </w:pPr>
       <w:r>
         <w:rPr>
           <w:rFonts w:ascii="Times New Roman" w:eastAsia="微軟正黑體" w:hAnsi="Times New Roman" w:cs="Times New Roman"/>
         </w:rPr>
         <w:t>LiaoWC</w:t>
       </w:r>
-      <w:proofErr w:type="spellEnd"/>
       <w:r>
         <w:rPr>
           <w:rFonts w:ascii="Times New Roman" w:eastAsia="微軟正黑體" w:hAnsi="Times New Roman" w:cs="Times New Roman" w:hint="eastAsia"/>
@@ -3069,22 +3966,10 @@
           <w:rPr>
             <w:rStyle w:val="a9"/>
             <w:rFonts w:ascii="Times New Roman" w:eastAsia="微軟正黑體" w:hAnsi="Times New Roman" w:cs="Times New Roman"/>
+            <w:sz w:val="22"/>
+            <w:szCs w:val="20"/>
           </w:rPr>
-          <w:t>https://liaowc.github.io/blog/mcts-monte-carlo-tre</w:t>
-        </w:r>
-        <w:r>
-          <w:rPr>
-            <w:rStyle w:val="a9"/>
-            <w:rFonts w:ascii="Times New Roman" w:eastAsia="微軟正黑體" w:hAnsi="Times New Roman" w:cs="Times New Roman"/>
-          </w:rPr>
-          <w:t>e</w:t>
-        </w:r>
-        <w:r>
-          <w:rPr>
-            <w:rStyle w:val="a9"/>
-            <w:rFonts w:ascii="Times New Roman" w:eastAsia="微軟正黑體" w:hAnsi="Times New Roman" w:cs="Times New Roman"/>
-          </w:rPr>
-          <w:t>-search/</w:t>
+          <w:t>https://liaowc.github.io/blog/mcts-monte-carlo-tree-search/</w:t>
         </w:r>
       </w:hyperlink>
     </w:p>
@@ -3113,21 +3998,7 @@
         <w:rPr>
           <w:rFonts w:ascii="Times New Roman" w:eastAsia="微軟正黑體" w:hAnsi="Times New Roman" w:cs="Times New Roman"/>
         </w:rPr>
-        <w:t xml:space="preserve">Julian </w:t>
-      </w:r>
-      <w:proofErr w:type="spellStart"/>
-      <w:r>
-        <w:rPr>
-          <w:rFonts w:ascii="Times New Roman" w:eastAsia="微軟正黑體" w:hAnsi="Times New Roman" w:cs="Times New Roman"/>
-        </w:rPr>
-        <w:t>Schrittwieser</w:t>
-      </w:r>
-      <w:proofErr w:type="spellEnd"/>
-      <w:r>
-        <w:rPr>
-          <w:rFonts w:ascii="Times New Roman" w:eastAsia="微軟正黑體" w:hAnsi="Times New Roman" w:cs="Times New Roman"/>
-        </w:rPr>
-        <w:t>, Karen Simonyan</w:t>
+        <w:t>Julian Schrittwieser, Karen Simonyan</w:t>
       </w:r>
       <w:r>
         <w:rPr>
@@ -3152,6 +4023,8 @@
           <w:rPr>
             <w:rStyle w:val="a9"/>
             <w:rFonts w:ascii="Times New Roman" w:eastAsia="微軟正黑體" w:hAnsi="Times New Roman" w:cs="Times New Roman"/>
+            <w:sz w:val="22"/>
+            <w:szCs w:val="20"/>
           </w:rPr>
           <w:t>https://discovery.ucl.ac.uk/id/eprint/10045895/1/agz_unformatted_nature.pdf</w:t>
         </w:r>
@@ -3166,28 +4039,117 @@
         </w:numPr>
         <w:spacing w:line="360" w:lineRule="exact"/>
         <w:rPr>
-          <w:rFonts w:ascii="Times New Roman" w:eastAsia="微軟正黑體" w:hAnsi="Times New Roman" w:cs="Times New Roman"/>
-        </w:rPr>
-      </w:pPr>
-      <w:r>
-        <w:rPr>
-          <w:rFonts w:ascii="Times New Roman" w:eastAsia="微軟正黑體" w:hAnsi="Times New Roman" w:cs="Times New Roman" w:hint="eastAsia"/>
-        </w:rPr>
-        <w:t xml:space="preserve">Fig.1. </w:t>
-      </w:r>
-      <w:r>
-        <w:rPr>
-          <w:rFonts w:ascii="Times New Roman" w:eastAsia="微軟正黑體" w:hAnsi="Times New Roman" w:cs="Times New Roman"/>
-        </w:rPr>
-        <w:t xml:space="preserve">Source: By Rmoss92 - Own work, CC BY-SA 4.0, </w:t>
+          <w:rStyle w:val="a9"/>
+          <w:rFonts w:ascii="Times New Roman" w:eastAsia="微軟正黑體" w:hAnsi="Times New Roman" w:cs="Times New Roman"/>
+          <w:color w:val="auto"/>
+          <w:sz w:val="22"/>
+          <w:szCs w:val="20"/>
+          <w:u w:val="none"/>
+        </w:rPr>
+      </w:pPr>
+      <w:r>
+        <w:rPr>
+          <w:rFonts w:ascii="Times New Roman" w:eastAsia="微軟正黑體" w:hAnsi="Times New Roman" w:cs="Times New Roman" w:hint="eastAsia"/>
+        </w:rPr>
+        <w:t>Fig.</w:t>
+      </w:r>
+      <w:r>
+        <w:rPr>
+          <w:rFonts w:ascii="Times New Roman" w:eastAsia="微軟正黑體" w:hAnsi="Times New Roman" w:cs="Times New Roman" w:hint="eastAsia"/>
+        </w:rPr>
+        <w:t xml:space="preserve"> </w:t>
+      </w:r>
+      <w:r>
+        <w:rPr>
+          <w:rFonts w:ascii="Times New Roman" w:eastAsia="微軟正黑體" w:hAnsi="Times New Roman" w:cs="Times New Roman" w:hint="eastAsia"/>
+        </w:rPr>
+        <w:t xml:space="preserve">1. </w:t>
+      </w:r>
+      <w:r>
+        <w:rPr>
+          <w:rFonts w:ascii="Times New Roman" w:eastAsia="微軟正黑體" w:hAnsi="Times New Roman" w:cs="Times New Roman" w:hint="eastAsia"/>
+        </w:rPr>
+        <w:t>s</w:t>
+      </w:r>
+      <w:r>
+        <w:rPr>
+          <w:rFonts w:ascii="Times New Roman" w:eastAsia="微軟正黑體" w:hAnsi="Times New Roman" w:cs="Times New Roman"/>
+        </w:rPr>
+        <w:t xml:space="preserve">ource: By Rmoss92 - Own work, CC BY-SA 4.0, </w:t>
       </w:r>
       <w:hyperlink r:id="rId12" w:history="1">
         <w:r>
           <w:rPr>
             <w:rStyle w:val="a9"/>
             <w:rFonts w:ascii="Times New Roman" w:eastAsia="微軟正黑體" w:hAnsi="Times New Roman" w:cs="Times New Roman"/>
+            <w:sz w:val="22"/>
+            <w:szCs w:val="20"/>
           </w:rPr>
           <w:t>https://commons.wikimedia.org/w/index.php?curid=88889583</w:t>
+        </w:r>
+      </w:hyperlink>
+    </w:p>
+    <w:p>
+      <w:pPr>
+        <w:pStyle w:val="a3"/>
+        <w:numPr>
+          <w:ilvl w:val="0"/>
+          <w:numId w:val="9"/>
+        </w:numPr>
+        <w:spacing w:line="360" w:lineRule="exact"/>
+        <w:rPr>
+          <w:rFonts w:ascii="Times New Roman" w:eastAsia="微軟正黑體" w:hAnsi="Times New Roman" w:cs="Times New Roman"/>
+        </w:rPr>
+      </w:pPr>
+      <w:r>
+        <w:rPr>
+          <w:rFonts w:ascii="Times New Roman" w:eastAsia="微軟正黑體" w:hAnsi="Times New Roman" w:cs="Times New Roman" w:hint="eastAsia"/>
+        </w:rPr>
+        <w:t xml:space="preserve">Fig. 2. source: </w:t>
+      </w:r>
+    </w:p>
+    <w:p>
+      <w:pPr>
+        <w:pStyle w:val="a3"/>
+        <w:spacing w:line="360" w:lineRule="exact"/>
+        <w:ind w:left="360"/>
+        <w:rPr>
+          <w:rFonts w:ascii="Times New Roman" w:eastAsia="微軟正黑體" w:hAnsi="Times New Roman" w:cs="Times New Roman"/>
+        </w:rPr>
+      </w:pPr>
+      <w:r>
+        <w:rPr>
+          <w:rFonts w:ascii="Times New Roman" w:eastAsia="微軟正黑體" w:hAnsi="Times New Roman" w:cs="Times New Roman"/>
+        </w:rPr>
+        <w:t>Guillaume M.J-B. Chaslot, Mark H.M. Winands, and H. Jaap van den Herik</w:t>
+      </w:r>
+      <w:r>
+        <w:rPr>
+          <w:rFonts w:ascii="Times New Roman" w:eastAsia="微軟正黑體" w:hAnsi="Times New Roman" w:cs="Times New Roman" w:hint="eastAsia"/>
+        </w:rPr>
+        <w:t xml:space="preserve"> / </w:t>
+      </w:r>
+      <w:r>
+        <w:rPr>
+          <w:rFonts w:ascii="Times New Roman" w:eastAsia="微軟正黑體" w:hAnsi="Times New Roman" w:cs="Times New Roman"/>
+        </w:rPr>
+        <w:t>Parallel Monte-Carlo Tree Search</w:t>
+      </w:r>
+      <w:r>
+        <w:rPr>
+          <w:rFonts w:ascii="Times New Roman" w:eastAsia="微軟正黑體" w:hAnsi="Times New Roman" w:cs="Times New Roman" w:hint="eastAsia"/>
+        </w:rPr>
+        <w:t xml:space="preserve">, </w:t>
+      </w:r>
+      <w:hyperlink r:id="rId13" w:history="1">
+        <w:r>
+          <w:rPr>
+            <w:rStyle w:val="a9"/>
+            <w:rFonts w:ascii="Times New Roman" w:eastAsia="微軟正黑體" w:hAnsi="Times New Roman" w:cs="Times New Roman"/>
+            <w:sz w:val="22"/>
+            <w:szCs w:val="20"/>
+          </w:rPr>
+          <w:t>https://dke.maastrichtuniversity.nl/m.winands/documents/multithreadedMCTS2.pdf</w:t>
         </w:r>
       </w:hyperlink>
     </w:p>
@@ -6303,7 +7265,7 @@
   <w:style w:type="paragraph" w:default="1" w:styleId="a">
     <w:name w:val="Normal"/>
     <w:qFormat/>
-    <w:rsid w:val="009D111D"/>
+    <w:rsid w:val="00BC63B6"/>
     <w:pPr>
       <w:widowControl w:val="0"/>
     </w:pPr>

</xml_diff>